<commit_message>
update project - fix UI & logic
</commit_message>
<xml_diff>
--- a/HOSONHCS/01 GQVL.docx
+++ b/HOSONHCS/01 GQVL.docx
@@ -174,10 +174,7 @@
         <w:t xml:space="preserve">Ngày sinh: </w:t>
       </w:r>
       <w:r>
-        <w:t>{{ngaysinh}}</w:t>
-      </w:r>
-      <w:r>
-        <w:t>,</w:t>
+        <w:t>{{ngaysinh}},</w:t>
       </w:r>
       <w:r>
         <w:t xml:space="preserve"> </w:t>
@@ -239,28 +236,37 @@
         <w:t xml:space="preserve">Ngày cấp: </w:t>
       </w:r>
       <w:r>
-        <w:t>{{ngaycap}},</w:t>
+        <w:t xml:space="preserve">{{ngaycap}}, </w:t>
+      </w:r>
+      <w:r>
+        <w:t xml:space="preserve">Nơi cấp: </w:t>
+      </w:r>
+      <w:r>
+        <w:rPr>
+          <w:spacing w:val="-29"/>
+        </w:rPr>
+        <w:t>{{noicap}}</w:t>
+      </w:r>
+      <w:r>
+        <w:rPr>
+          <w:spacing w:val="-29"/>
+        </w:rPr>
+        <w:t>,</w:t>
       </w:r>
       <w:r>
         <w:t xml:space="preserve"> </w:t>
       </w:r>
       <w:r>
-        <w:t xml:space="preserve">Nơi cấp: </w:t>
-      </w:r>
-      <w:r>
-        <w:rPr>
-          <w:spacing w:val="-29"/>
-        </w:rPr>
-        <w:t>{{noicap}}</w:t>
-      </w:r>
-      <w:r>
-        <w:t xml:space="preserve"> </w:t>
-      </w:r>
-      <w:r>
         <w:t>Có thời hạn đến:</w:t>
       </w:r>
       <w:r>
-        <w:t xml:space="preserve"> {{thoihan}}</w:t>
+        <w:t xml:space="preserve"> {{thoihan</w:t>
+      </w:r>
+      <w:r>
+        <w:t>cccd</w:t>
+      </w:r>
+      <w:r>
+        <w:t>}}</w:t>
       </w:r>
     </w:p>
     <w:p>
@@ -1417,10 +1423,7 @@
         <w:t xml:space="preserve">Kỳ hạn trả gốc: </w:t>
       </w:r>
       <w:r>
-        <w:t>{{phanky}}</w:t>
-      </w:r>
-      <w:r>
-        <w:t>,</w:t>
+        <w:t>{{phanky}},</w:t>
       </w:r>
       <w:r>
         <w:t xml:space="preserve"> Kỳ hạn trả lãi: </w:t>
@@ -2946,7 +2949,7 @@
       <w:headerReference w:type="first" r:id="rId9"/>
       <w:footerReference w:type="first" r:id="rId10"/>
       <w:pgSz w:w="11909" w:h="16834" w:code="9"/>
-      <w:pgMar w:top="1134" w:right="1134" w:bottom="1134" w:left="1701" w:header="567" w:footer="567" w:gutter="0"/>
+      <w:pgMar w:top="1134" w:right="994" w:bottom="1134" w:left="1701" w:header="567" w:footer="567" w:gutter="0"/>
       <w:cols w:space="720"/>
       <w:titlePg/>
       <w:docGrid w:linePitch="381"/>

</xml_diff>

<commit_message>
UPDATE 5.1.5 - 12.3.2026
</commit_message>
<xml_diff>
--- a/HOSONHCS/01 GQVL.docx
+++ b/HOSONHCS/01 GQVL.docx
@@ -615,10 +615,10 @@
         <w:t>)</w:t>
       </w:r>
       <w:r>
-        <w:t>: …</w:t>
-      </w:r>
-      <w:r>
-        <w:t>..</w:t>
+        <w:t xml:space="preserve">: </w:t>
+      </w:r>
+      <w:r>
+        <w:t>01</w:t>
       </w:r>
       <w:r>
         <w:t xml:space="preserve"> người, trong đó:</w:t>
@@ -755,7 +755,13 @@
               <w:t xml:space="preserve">lao động là </w:t>
             </w:r>
             <w:r>
-              <w:t>thành viên thuộc hộ gia đình: ............người</w:t>
+              <w:t xml:space="preserve">thành viên thuộc hộ gia đình: </w:t>
+            </w:r>
+            <w:r>
+              <w:t xml:space="preserve">01 </w:t>
+            </w:r>
+            <w:r>
+              <w:t>người</w:t>
             </w:r>
           </w:p>
           <w:p>
@@ -1479,7 +1485,19 @@
               <w:rPr>
                 <w:i/>
               </w:rPr>
-              <w:t>..., ngày ... tháng ... năm ...</w:t>
+              <w:t>.............</w:t>
+            </w:r>
+            <w:r>
+              <w:rPr>
+                <w:i/>
+              </w:rPr>
+              <w:t xml:space="preserve">..., </w:t>
+            </w:r>
+            <w:r>
+              <w:rPr>
+                <w:i/>
+              </w:rPr>
+              <w:t>{{ngaylaphs}}</w:t>
             </w:r>
             <w:r>
               <w:br/>
@@ -1956,8 +1974,6 @@
     <w:p/>
     <w:p/>
     <w:p/>
-    <w:p/>
-    <w:p/>
     <w:p>
       <w:pPr>
         <w:spacing w:line="360" w:lineRule="exact"/>
@@ -2114,841 +2130,6 @@
         </w:rPr>
       </w:pPr>
     </w:p>
-    <w:p>
-      <w:pPr>
-        <w:spacing w:line="360" w:lineRule="exact"/>
-        <w:jc w:val="both"/>
-        <w:rPr>
-          <w:b/>
-          <w:i/>
-          <w:sz w:val="22"/>
-          <w:szCs w:val="22"/>
-        </w:rPr>
-      </w:pPr>
-    </w:p>
-    <w:p>
-      <w:pPr>
-        <w:spacing w:line="360" w:lineRule="exact"/>
-        <w:jc w:val="both"/>
-        <w:rPr>
-          <w:b/>
-          <w:i/>
-          <w:sz w:val="22"/>
-          <w:szCs w:val="22"/>
-        </w:rPr>
-      </w:pPr>
-    </w:p>
-    <w:p>
-      <w:pPr>
-        <w:spacing w:line="360" w:lineRule="exact"/>
-        <w:jc w:val="both"/>
-        <w:rPr>
-          <w:b/>
-          <w:i/>
-          <w:sz w:val="22"/>
-          <w:szCs w:val="22"/>
-        </w:rPr>
-      </w:pPr>
-    </w:p>
-    <w:p>
-      <w:pPr>
-        <w:spacing w:line="360" w:lineRule="exact"/>
-        <w:jc w:val="both"/>
-        <w:rPr>
-          <w:b/>
-          <w:i/>
-          <w:sz w:val="22"/>
-          <w:szCs w:val="22"/>
-        </w:rPr>
-      </w:pPr>
-    </w:p>
-    <w:p>
-      <w:pPr>
-        <w:spacing w:line="360" w:lineRule="exact"/>
-        <w:jc w:val="both"/>
-        <w:rPr>
-          <w:b/>
-          <w:i/>
-          <w:sz w:val="22"/>
-          <w:szCs w:val="22"/>
-        </w:rPr>
-      </w:pPr>
-    </w:p>
-    <w:p>
-      <w:pPr>
-        <w:spacing w:line="360" w:lineRule="exact"/>
-        <w:jc w:val="both"/>
-        <w:rPr>
-          <w:b/>
-          <w:i/>
-          <w:sz w:val="22"/>
-          <w:szCs w:val="22"/>
-        </w:rPr>
-      </w:pPr>
-    </w:p>
-    <w:p>
-      <w:pPr>
-        <w:spacing w:line="360" w:lineRule="exact"/>
-        <w:jc w:val="both"/>
-        <w:rPr>
-          <w:b/>
-          <w:i/>
-          <w:sz w:val="22"/>
-          <w:szCs w:val="22"/>
-        </w:rPr>
-      </w:pPr>
-    </w:p>
-    <w:p>
-      <w:pPr>
-        <w:spacing w:line="360" w:lineRule="exact"/>
-        <w:jc w:val="both"/>
-        <w:rPr>
-          <w:b/>
-          <w:i/>
-          <w:sz w:val="22"/>
-          <w:szCs w:val="22"/>
-        </w:rPr>
-      </w:pPr>
-    </w:p>
-    <w:p>
-      <w:pPr>
-        <w:spacing w:line="360" w:lineRule="exact"/>
-        <w:jc w:val="both"/>
-        <w:rPr>
-          <w:b/>
-          <w:i/>
-          <w:sz w:val="22"/>
-          <w:szCs w:val="22"/>
-        </w:rPr>
-      </w:pPr>
-    </w:p>
-    <w:p>
-      <w:pPr>
-        <w:spacing w:line="360" w:lineRule="exact"/>
-        <w:jc w:val="both"/>
-        <w:rPr>
-          <w:b/>
-          <w:i/>
-          <w:sz w:val="22"/>
-          <w:szCs w:val="22"/>
-        </w:rPr>
-      </w:pPr>
-    </w:p>
-    <w:p>
-      <w:pPr>
-        <w:spacing w:line="360" w:lineRule="exact"/>
-        <w:jc w:val="both"/>
-        <w:rPr>
-          <w:b/>
-          <w:i/>
-          <w:sz w:val="22"/>
-          <w:szCs w:val="22"/>
-        </w:rPr>
-      </w:pPr>
-      <w:r>
-        <w:rPr>
-          <w:b/>
-          <w:i/>
-          <w:sz w:val="22"/>
-          <w:szCs w:val="22"/>
-        </w:rPr>
-        <w:lastRenderedPageBreak/>
-        <w:t>Ghi chú:</w:t>
-      </w:r>
-    </w:p>
-    <w:p>
-      <w:pPr>
-        <w:spacing w:line="360" w:lineRule="exact"/>
-        <w:jc w:val="both"/>
-        <w:rPr>
-          <w:sz w:val="22"/>
-          <w:szCs w:val="22"/>
-        </w:rPr>
-      </w:pPr>
-      <w:r>
-        <w:rPr>
-          <w:b/>
-          <w:sz w:val="22"/>
-          <w:szCs w:val="22"/>
-        </w:rPr>
-        <w:t>(1)</w:t>
-      </w:r>
-      <w:r>
-        <w:rPr>
-          <w:sz w:val="22"/>
-          <w:szCs w:val="22"/>
-        </w:rPr>
-        <w:t xml:space="preserve">  Trường hợp đề nghị vay vốn tại nơi thường trú thì ghi thông tin nơi thường trú; trường hợp đề nghị vay vốn tại nơi tạm trú thì ghi thông tin nơi tạm trú. </w:t>
-      </w:r>
-    </w:p>
-    <w:p>
-      <w:pPr>
-        <w:spacing w:line="360" w:lineRule="exact"/>
-        <w:jc w:val="both"/>
-        <w:rPr>
-          <w:sz w:val="22"/>
-          <w:szCs w:val="22"/>
-        </w:rPr>
-      </w:pPr>
-      <w:r>
-        <w:rPr>
-          <w:b/>
-          <w:sz w:val="22"/>
-          <w:szCs w:val="22"/>
-        </w:rPr>
-        <w:t>(2)</w:t>
-      </w:r>
-      <w:r>
-        <w:rPr>
-          <w:sz w:val="22"/>
-          <w:szCs w:val="22"/>
-        </w:rPr>
-        <w:t xml:space="preserve"> Thuộc đối tượng khác</w:t>
-      </w:r>
-      <w:r>
-        <w:rPr>
-          <w:sz w:val="22"/>
-          <w:szCs w:val="22"/>
-        </w:rPr>
-        <w:t xml:space="preserve"> theo quy định của cấp có thẩm quyền được vay vốn hỗ trợ tạo việc làm, duy trì, mở rộng việc làm</w:t>
-      </w:r>
-      <w:r>
-        <w:rPr>
-          <w:sz w:val="22"/>
-          <w:szCs w:val="22"/>
-        </w:rPr>
-        <w:t xml:space="preserve">: </w:t>
-      </w:r>
-    </w:p>
-    <w:p>
-      <w:pPr>
-        <w:spacing w:line="360" w:lineRule="exact"/>
-        <w:jc w:val="both"/>
-        <w:rPr>
-          <w:sz w:val="22"/>
-          <w:szCs w:val="22"/>
-        </w:rPr>
-      </w:pPr>
-      <w:r>
-        <w:rPr>
-          <w:sz w:val="22"/>
-          <w:szCs w:val="22"/>
-        </w:rPr>
-        <w:t xml:space="preserve">- </w:t>
-      </w:r>
-      <w:r>
-        <w:rPr>
-          <w:b/>
-          <w:sz w:val="22"/>
-          <w:szCs w:val="22"/>
-        </w:rPr>
-        <w:t>Người cao tuổi</w:t>
-      </w:r>
-      <w:r>
-        <w:rPr>
-          <w:sz w:val="22"/>
-          <w:szCs w:val="22"/>
-        </w:rPr>
-        <w:t xml:space="preserve"> theo văn bản hướng dẫn số 591/NHCS-TDSV</w:t>
-      </w:r>
-      <w:r>
-        <w:rPr>
-          <w:sz w:val="22"/>
-          <w:szCs w:val="22"/>
-        </w:rPr>
-        <w:t xml:space="preserve"> ngày 12/8/2019</w:t>
-      </w:r>
-      <w:r>
-        <w:rPr>
-          <w:sz w:val="22"/>
-          <w:szCs w:val="22"/>
-        </w:rPr>
-        <w:t>;</w:t>
-      </w:r>
-    </w:p>
-    <w:p>
-      <w:pPr>
-        <w:spacing w:line="360" w:lineRule="exact"/>
-        <w:jc w:val="both"/>
-        <w:rPr>
-          <w:sz w:val="22"/>
-          <w:szCs w:val="22"/>
-        </w:rPr>
-      </w:pPr>
-      <w:r>
-        <w:rPr>
-          <w:sz w:val="22"/>
-          <w:szCs w:val="22"/>
-        </w:rPr>
-        <w:t xml:space="preserve">- </w:t>
-      </w:r>
-      <w:r>
-        <w:rPr>
-          <w:b/>
-          <w:sz w:val="22"/>
-          <w:szCs w:val="22"/>
-        </w:rPr>
-        <w:t>Người lao động trong gia đình người tâm thần, trẻ em tự kỷ và người rối nhiễu tâm trí</w:t>
-      </w:r>
-      <w:r>
-        <w:rPr>
-          <w:sz w:val="22"/>
-          <w:szCs w:val="22"/>
-        </w:rPr>
-        <w:t xml:space="preserve"> theo văn bản hướng dẫn số 6216/NHCS-TDSV ngày 09/7/2021;</w:t>
-      </w:r>
-    </w:p>
-    <w:p>
-      <w:pPr>
-        <w:spacing w:line="360" w:lineRule="exact"/>
-        <w:jc w:val="both"/>
-        <w:rPr>
-          <w:sz w:val="22"/>
-          <w:szCs w:val="22"/>
-        </w:rPr>
-      </w:pPr>
-      <w:r>
-        <w:rPr>
-          <w:sz w:val="22"/>
-          <w:szCs w:val="22"/>
-        </w:rPr>
-        <w:t xml:space="preserve">- </w:t>
-      </w:r>
-      <w:r>
-        <w:rPr>
-          <w:b/>
-          <w:sz w:val="22"/>
-          <w:szCs w:val="22"/>
-        </w:rPr>
-        <w:t>Người có đất thu hồi</w:t>
-      </w:r>
-      <w:r>
-        <w:rPr>
-          <w:sz w:val="22"/>
-          <w:szCs w:val="22"/>
-        </w:rPr>
-        <w:t xml:space="preserve"> theo văn bản hướng dẫn số 4545/HD-NHCS ngày 01/8/2024;</w:t>
-      </w:r>
-    </w:p>
-    <w:p>
-      <w:pPr>
-        <w:spacing w:line="360" w:lineRule="exact"/>
-        <w:jc w:val="both"/>
-        <w:rPr>
-          <w:sz w:val="22"/>
-          <w:szCs w:val="22"/>
-        </w:rPr>
-      </w:pPr>
-      <w:r>
-        <w:rPr>
-          <w:sz w:val="22"/>
-          <w:szCs w:val="22"/>
-        </w:rPr>
-        <w:t xml:space="preserve">- Các đối tượng khác theo văn bản hướng dẫn của cấp có thẩm quyền. </w:t>
-      </w:r>
-    </w:p>
-    <w:p>
-      <w:pPr>
-        <w:tabs>
-          <w:tab w:val="right" w:leader="dot" w:pos="8789"/>
-        </w:tabs>
-        <w:spacing w:before="120"/>
-        <w:jc w:val="both"/>
-        <w:rPr>
-          <w:sz w:val="22"/>
-          <w:szCs w:val="22"/>
-        </w:rPr>
-      </w:pPr>
-      <w:r>
-        <w:rPr>
-          <w:b/>
-          <w:sz w:val="22"/>
-          <w:szCs w:val="22"/>
-        </w:rPr>
-        <w:t>(</w:t>
-      </w:r>
-      <w:r>
-        <w:rPr>
-          <w:b/>
-          <w:sz w:val="22"/>
-          <w:szCs w:val="22"/>
-        </w:rPr>
-        <w:t>3</w:t>
-      </w:r>
-      <w:r>
-        <w:rPr>
-          <w:b/>
-          <w:sz w:val="22"/>
-          <w:szCs w:val="22"/>
-        </w:rPr>
-        <w:t>)</w:t>
-      </w:r>
-      <w:r>
-        <w:rPr>
-          <w:sz w:val="22"/>
-          <w:szCs w:val="22"/>
-        </w:rPr>
-        <w:t xml:space="preserve"> Thông tin, giấy tờ xác nhận đối tượng ưu tiên dành cho đối tượng ưu tiên, cụ thể:</w:t>
-      </w:r>
-    </w:p>
-    <w:p>
-      <w:pPr>
-        <w:tabs>
-          <w:tab w:val="right" w:leader="dot" w:pos="8789"/>
-        </w:tabs>
-        <w:spacing w:before="120"/>
-        <w:jc w:val="both"/>
-        <w:rPr>
-          <w:b/>
-          <w:sz w:val="22"/>
-          <w:szCs w:val="22"/>
-        </w:rPr>
-      </w:pPr>
-      <w:r>
-        <w:rPr>
-          <w:b/>
-          <w:sz w:val="22"/>
-          <w:szCs w:val="22"/>
-        </w:rPr>
-        <w:t>- Đối với người lao động là người dân tộc thiểu số thuộc hộ nghèo:</w:t>
-      </w:r>
-      <w:r>
-        <w:rPr>
-          <w:b/>
-          <w:sz w:val="22"/>
-          <w:szCs w:val="22"/>
-        </w:rPr>
-        <w:t xml:space="preserve"> </w:t>
-      </w:r>
-      <w:r>
-        <w:rPr>
-          <w:sz w:val="22"/>
-          <w:szCs w:val="22"/>
-        </w:rPr>
-        <w:t xml:space="preserve">Giấy </w:t>
-      </w:r>
-      <w:r>
-        <w:rPr>
-          <w:sz w:val="22"/>
-          <w:szCs w:val="22"/>
-        </w:rPr>
-        <w:t xml:space="preserve">tờ chứng minh về dân tộc </w:t>
-      </w:r>
-      <w:r>
-        <w:rPr>
-          <w:sz w:val="22"/>
-          <w:szCs w:val="22"/>
-        </w:rPr>
-        <w:t xml:space="preserve">và Giấy </w:t>
-      </w:r>
-      <w:r>
-        <w:rPr>
-          <w:sz w:val="22"/>
-          <w:szCs w:val="22"/>
-        </w:rPr>
-        <w:t>chứng nhận hộ</w:t>
-      </w:r>
-      <w:r>
-        <w:rPr>
-          <w:sz w:val="22"/>
-          <w:szCs w:val="22"/>
-        </w:rPr>
-        <w:t xml:space="preserve"> gia đình</w:t>
-      </w:r>
-      <w:r>
-        <w:rPr>
-          <w:sz w:val="22"/>
-          <w:szCs w:val="22"/>
-        </w:rPr>
-        <w:t xml:space="preserve"> nghèo theo quy định.</w:t>
-      </w:r>
-    </w:p>
-    <w:p>
-      <w:pPr>
-        <w:tabs>
-          <w:tab w:val="right" w:leader="dot" w:pos="8789"/>
-        </w:tabs>
-        <w:spacing w:before="120"/>
-        <w:jc w:val="both"/>
-        <w:rPr>
-          <w:b/>
-          <w:sz w:val="22"/>
-          <w:szCs w:val="22"/>
-        </w:rPr>
-      </w:pPr>
-      <w:r>
-        <w:rPr>
-          <w:b/>
-          <w:sz w:val="22"/>
-          <w:szCs w:val="22"/>
-        </w:rPr>
-        <w:t>- Đối với người lao động là người dân tộc Kinh thuộc hộ nghèo đang sinh sống tại địa bàn có điều kiện kinh tế – xã hội đặc biệt khó khăn</w:t>
-      </w:r>
-      <w:r>
-        <w:rPr>
-          <w:b/>
-          <w:sz w:val="22"/>
-          <w:szCs w:val="22"/>
-          <w:lang w:val="vi-VN"/>
-        </w:rPr>
-        <w:t xml:space="preserve"> (người có nơi ở hiện tại thuộc thôn, xã đặc biệt khó khăn vùng đồng bào dân tộc thiểu số và miền núi hoặc các địa bàn khác theo quyết định của cơ quan nhà nước có thẩm quyền)</w:t>
-      </w:r>
-      <w:r>
-        <w:rPr>
-          <w:b/>
-          <w:sz w:val="22"/>
-          <w:szCs w:val="22"/>
-        </w:rPr>
-        <w:t>:</w:t>
-      </w:r>
-      <w:r>
-        <w:rPr>
-          <w:b/>
-          <w:sz w:val="22"/>
-          <w:szCs w:val="22"/>
-        </w:rPr>
-        <w:t xml:space="preserve"> </w:t>
-      </w:r>
-      <w:r>
-        <w:rPr>
-          <w:sz w:val="22"/>
-          <w:szCs w:val="22"/>
-        </w:rPr>
-        <w:t>Giấy tờ chứng minh về nơi ở hiện tại và Giấy chứng nhận hộ gia đình nghèo theo quy định.</w:t>
-      </w:r>
-    </w:p>
-    <w:p>
-      <w:pPr>
-        <w:tabs>
-          <w:tab w:val="right" w:leader="dot" w:pos="8789"/>
-        </w:tabs>
-        <w:spacing w:before="120" w:line="360" w:lineRule="exact"/>
-        <w:jc w:val="both"/>
-        <w:rPr>
-          <w:b/>
-          <w:sz w:val="22"/>
-          <w:szCs w:val="22"/>
-        </w:rPr>
-      </w:pPr>
-      <w:r>
-        <w:rPr>
-          <w:b/>
-          <w:sz w:val="22"/>
-          <w:szCs w:val="22"/>
-        </w:rPr>
-        <w:t>- Đối với người lao động là Người khuyết tật, đề nghị kê khai:</w:t>
-      </w:r>
-      <w:r>
-        <w:rPr>
-          <w:sz w:val="22"/>
-          <w:szCs w:val="22"/>
-        </w:rPr>
-        <w:t xml:space="preserve"> Giấy xác nhận khuyết tật số …... do Ủy ban nhân dân xã/phường/đặc khu ……...…. cấp ngày ..........</w:t>
-      </w:r>
-    </w:p>
-    <w:p>
-      <w:pPr>
-        <w:tabs>
-          <w:tab w:val="right" w:leader="dot" w:pos="8789"/>
-        </w:tabs>
-        <w:spacing w:before="120"/>
-        <w:jc w:val="both"/>
-        <w:rPr>
-          <w:b/>
-          <w:sz w:val="22"/>
-          <w:szCs w:val="22"/>
-        </w:rPr>
-      </w:pPr>
-      <w:r>
-        <w:rPr>
-          <w:sz w:val="22"/>
-          <w:szCs w:val="22"/>
-        </w:rPr>
-        <w:tab/>
-      </w:r>
-      <w:r>
-        <w:rPr>
-          <w:b/>
-          <w:sz w:val="22"/>
-          <w:szCs w:val="22"/>
-        </w:rPr>
-        <w:t>- Đối với Người lao động trong hộ gia đình đang trực tiếp nuôi dưỡng, chăm sóc người khuyết tật đặc biệt nặng, đề nghị kê khai:</w:t>
-      </w:r>
-    </w:p>
-    <w:p>
-      <w:pPr>
-        <w:tabs>
-          <w:tab w:val="right" w:leader="dot" w:pos="8789"/>
-        </w:tabs>
-        <w:spacing w:before="120"/>
-        <w:jc w:val="both"/>
-        <w:rPr>
-          <w:sz w:val="22"/>
-          <w:szCs w:val="22"/>
-        </w:rPr>
-      </w:pPr>
-      <w:r>
-        <w:rPr>
-          <w:sz w:val="22"/>
-          <w:szCs w:val="22"/>
-        </w:rPr>
-        <w:t>+ Họ và tên Người khuyết tật/người khuyết tật đặc biệt nặng:............</w:t>
-      </w:r>
-    </w:p>
-    <w:p>
-      <w:pPr>
-        <w:tabs>
-          <w:tab w:val="right" w:leader="dot" w:pos="8789"/>
-        </w:tabs>
-        <w:spacing w:before="120"/>
-        <w:jc w:val="both"/>
-        <w:rPr>
-          <w:sz w:val="22"/>
-          <w:szCs w:val="22"/>
-        </w:rPr>
-      </w:pPr>
-      <w:r>
-        <w:rPr>
-          <w:sz w:val="22"/>
-          <w:szCs w:val="22"/>
-        </w:rPr>
-        <w:t>+ Giấy xác nhận khuyết tật số ……do Ủy ban nhân dân xã/ phường/đặc khu …… cấp ngày ..........</w:t>
-      </w:r>
-    </w:p>
-    <w:p>
-      <w:pPr>
-        <w:tabs>
-          <w:tab w:val="right" w:leader="dot" w:pos="8789"/>
-        </w:tabs>
-        <w:spacing w:before="120"/>
-        <w:jc w:val="both"/>
-        <w:rPr>
-          <w:sz w:val="22"/>
-          <w:szCs w:val="22"/>
-        </w:rPr>
-      </w:pPr>
-      <w:r>
-        <w:rPr>
-          <w:sz w:val="22"/>
-          <w:szCs w:val="22"/>
-        </w:rPr>
-        <w:t>+ Hoặc Quyết định hỗ trợ kinh phí chăm sóc, nuôi dưỡng hàng tháng số ................cấp ngày.............</w:t>
-      </w:r>
-    </w:p>
-    <w:p>
-      <w:pPr>
-        <w:tabs>
-          <w:tab w:val="right" w:leader="dot" w:pos="8789"/>
-        </w:tabs>
-        <w:spacing w:before="120"/>
-        <w:jc w:val="both"/>
-        <w:rPr>
-          <w:b/>
-          <w:sz w:val="22"/>
-          <w:szCs w:val="22"/>
-        </w:rPr>
-      </w:pPr>
-      <w:r>
-        <w:rPr>
-          <w:b/>
-          <w:sz w:val="22"/>
-          <w:szCs w:val="22"/>
-        </w:rPr>
-        <w:t>- Đối với Người lao động nhận nuôi dưỡng, chăm sóc người khuyết tật đặc biệt nặng, đề nghị kê khai:</w:t>
-      </w:r>
-    </w:p>
-    <w:p>
-      <w:pPr>
-        <w:tabs>
-          <w:tab w:val="right" w:leader="dot" w:pos="8789"/>
-        </w:tabs>
-        <w:spacing w:before="120"/>
-        <w:jc w:val="both"/>
-        <w:rPr>
-          <w:sz w:val="22"/>
-          <w:szCs w:val="22"/>
-        </w:rPr>
-      </w:pPr>
-      <w:r>
-        <w:rPr>
-          <w:sz w:val="22"/>
-          <w:szCs w:val="22"/>
-        </w:rPr>
-        <w:t>+ Họ và tên Người khuyết tật/Người khuyết tật đặc biệt nặng:.............</w:t>
-      </w:r>
-    </w:p>
-    <w:p>
-      <w:pPr>
-        <w:tabs>
-          <w:tab w:val="right" w:leader="dot" w:pos="8789"/>
-        </w:tabs>
-        <w:spacing w:before="120"/>
-        <w:jc w:val="both"/>
-        <w:rPr>
-          <w:sz w:val="22"/>
-          <w:szCs w:val="22"/>
-        </w:rPr>
-      </w:pPr>
-      <w:r>
-        <w:rPr>
-          <w:sz w:val="22"/>
-          <w:szCs w:val="22"/>
-        </w:rPr>
-        <w:t>+ Giấy xác nhận khuyết tật số …… do Ủy ban nhân dân xã/phường/đặc khu ….....cấp ngày .............</w:t>
-      </w:r>
-    </w:p>
-    <w:p>
-      <w:pPr>
-        <w:tabs>
-          <w:tab w:val="right" w:leader="dot" w:pos="8789"/>
-        </w:tabs>
-        <w:spacing w:before="120"/>
-        <w:jc w:val="both"/>
-        <w:rPr>
-          <w:sz w:val="22"/>
-          <w:szCs w:val="22"/>
-        </w:rPr>
-      </w:pPr>
-      <w:r>
-        <w:rPr>
-          <w:sz w:val="22"/>
-          <w:szCs w:val="22"/>
-        </w:rPr>
-        <w:t>+ Quyết định hỗ trợ kinh phí chăm sóc, nuôi dưỡng hằng tháng số:.............cấp ngày............</w:t>
-      </w:r>
-    </w:p>
-    <w:p>
-      <w:pPr>
-        <w:tabs>
-          <w:tab w:val="right" w:leader="dot" w:pos="8789"/>
-        </w:tabs>
-        <w:spacing w:before="120"/>
-        <w:jc w:val="both"/>
-        <w:rPr>
-          <w:sz w:val="22"/>
-          <w:szCs w:val="22"/>
-        </w:rPr>
-      </w:pPr>
-      <w:r>
-        <w:rPr>
-          <w:sz w:val="22"/>
-          <w:szCs w:val="22"/>
-        </w:rPr>
-        <w:t>+ Hoặc Quyết định nhận chăm sóc, nuôi dưỡng số:………....cấp ngày….......................……</w:t>
-      </w:r>
-    </w:p>
-    <w:p>
-      <w:pPr>
-        <w:tabs>
-          <w:tab w:val="right" w:leader="dot" w:pos="8789"/>
-        </w:tabs>
-        <w:spacing w:before="120"/>
-        <w:jc w:val="both"/>
-        <w:rPr>
-          <w:sz w:val="22"/>
-          <w:szCs w:val="22"/>
-        </w:rPr>
-      </w:pPr>
-      <w:r>
-        <w:rPr>
-          <w:b/>
-          <w:sz w:val="22"/>
-          <w:szCs w:val="22"/>
-        </w:rPr>
-        <w:t>(</w:t>
-      </w:r>
-      <w:r>
-        <w:rPr>
-          <w:b/>
-          <w:sz w:val="22"/>
-          <w:szCs w:val="22"/>
-        </w:rPr>
-        <w:t>4</w:t>
-      </w:r>
-      <w:r>
-        <w:rPr>
-          <w:b/>
-          <w:sz w:val="22"/>
-          <w:szCs w:val="22"/>
-        </w:rPr>
-        <w:t>)</w:t>
-      </w:r>
-      <w:r>
-        <w:rPr>
-          <w:sz w:val="22"/>
-          <w:szCs w:val="22"/>
-        </w:rPr>
-        <w:t xml:space="preserve"> </w:t>
-      </w:r>
-      <w:r>
-        <w:rPr>
-          <w:sz w:val="22"/>
-          <w:szCs w:val="22"/>
-        </w:rPr>
-        <w:t>Người lao động là công dân Việt Nam từ đủ 15 tuổi trở lên, có khả năng lao động và có nhu cầu làm việc.</w:t>
-      </w:r>
-    </w:p>
-    <w:p>
-      <w:pPr>
-        <w:tabs>
-          <w:tab w:val="right" w:leader="dot" w:pos="8789"/>
-        </w:tabs>
-        <w:spacing w:before="120"/>
-        <w:jc w:val="both"/>
-        <w:rPr>
-          <w:sz w:val="22"/>
-          <w:szCs w:val="22"/>
-        </w:rPr>
-      </w:pPr>
-      <w:r>
-        <w:rPr>
-          <w:sz w:val="22"/>
-          <w:szCs w:val="22"/>
-        </w:rPr>
-        <w:t>- Tạo việc làm là tạo việc làm cho người thất nghiệp;</w:t>
-      </w:r>
-    </w:p>
-    <w:p>
-      <w:pPr>
-        <w:tabs>
-          <w:tab w:val="right" w:leader="dot" w:pos="8789"/>
-        </w:tabs>
-        <w:spacing w:before="120"/>
-        <w:jc w:val="both"/>
-        <w:rPr>
-          <w:sz w:val="22"/>
-          <w:szCs w:val="22"/>
-        </w:rPr>
-      </w:pPr>
-      <w:r>
-        <w:rPr>
-          <w:sz w:val="22"/>
-          <w:szCs w:val="22"/>
-        </w:rPr>
-        <w:t>- Duy trì việc làm là duy trì việc làm hiện có của người lao động;</w:t>
-      </w:r>
-    </w:p>
-    <w:p>
-      <w:pPr>
-        <w:tabs>
-          <w:tab w:val="right" w:leader="dot" w:pos="8789"/>
-        </w:tabs>
-        <w:spacing w:before="120"/>
-        <w:jc w:val="both"/>
-        <w:rPr>
-          <w:sz w:val="22"/>
-          <w:szCs w:val="22"/>
-        </w:rPr>
-      </w:pPr>
-      <w:r>
-        <w:rPr>
-          <w:sz w:val="22"/>
-          <w:szCs w:val="22"/>
-        </w:rPr>
-        <w:t>- Mở rộng việc làm là việc thu hút thêm lao động hoặc tạo thêm việc làm khác cho người lao động.</w:t>
-      </w:r>
-    </w:p>
-    <w:p/>
     <w:sectPr>
       <w:footerReference w:type="even" r:id="rId7"/>
       <w:footerReference w:type="default" r:id="rId8"/>

</xml_diff>